<commit_message>
+ authrouter untuk menentukan routes pembeda antara sudah login dan belum login
</commit_message>
<xml_diff>
--- a/dokumentasi.docx
+++ b/dokumentasi.docx
@@ -10,11 +10,9 @@
           <w:numId w:val="1"/>
         </w:numPr>
       </w:pPr>
-      <w:proofErr w:type="spellStart"/>
       <w:r>
         <w:t>Graphql</w:t>
       </w:r>
-      <w:proofErr w:type="spellEnd"/>
     </w:p>
     <w:p>
       <w:pPr>
@@ -43,23 +41,7 @@
           <w:b/>
           <w:bCs/>
         </w:rPr>
-        <w:t xml:space="preserve">Queries </w:t>
-      </w:r>
-      <w:proofErr w:type="spellStart"/>
-      <w:r>
-        <w:rPr>
-          <w:b/>
-          <w:bCs/>
-        </w:rPr>
-        <w:t>retrive</w:t>
-      </w:r>
-      <w:proofErr w:type="spellEnd"/>
-      <w:r>
-        <w:rPr>
-          <w:b/>
-          <w:bCs/>
-        </w:rPr>
-        <w:t xml:space="preserve"> data</w:t>
+        <w:t>Queries retrive data</w:t>
       </w:r>
     </w:p>
     <w:p>
@@ -84,7 +66,6 @@
           <w:bCs/>
         </w:rPr>
       </w:pPr>
-      <w:proofErr w:type="spellStart"/>
       <w:r>
         <w:rPr>
           <w:b/>
@@ -99,7 +80,6 @@
         </w:rPr>
         <w:t>ubscribtion</w:t>
       </w:r>
-      <w:proofErr w:type="spellEnd"/>
     </w:p>
     <w:p>
       <w:pPr>
@@ -134,7 +114,7 @@
                     <pic:cNvPicPr/>
                   </pic:nvPicPr>
                   <pic:blipFill>
-                    <a:blip r:embed="rId5"/>
+                    <a:blip r:embed="rId6"/>
                     <a:stretch>
                       <a:fillRect/>
                     </a:stretch>
@@ -189,7 +169,7 @@
                     <pic:cNvPicPr/>
                   </pic:nvPicPr>
                   <pic:blipFill>
-                    <a:blip r:embed="rId6"/>
+                    <a:blip r:embed="rId7"/>
                     <a:stretch>
                       <a:fillRect/>
                     </a:stretch>
@@ -212,15 +192,7 @@
     </w:p>
     <w:p>
       <w:r>
-        <w:t xml:space="preserve">Integrasi </w:t>
-      </w:r>
-      <w:proofErr w:type="spellStart"/>
-      <w:r>
-        <w:t>awal</w:t>
-      </w:r>
-      <w:proofErr w:type="spellEnd"/>
-      <w:r>
-        <w:t xml:space="preserve"> apollo server</w:t>
+        <w:t>Integrasi awal apollo server</w:t>
       </w:r>
     </w:p>
     <w:p>
@@ -235,67 +207,18 @@
         <w:t>index node</w:t>
       </w:r>
       <w:r>
-        <w:t xml:space="preserve"> </w:t>
-      </w:r>
-      <w:proofErr w:type="spellStart"/>
-      <w:r>
-        <w:t>kemudian</w:t>
-      </w:r>
-      <w:proofErr w:type="spellEnd"/>
-      <w:r>
-        <w:t xml:space="preserve"> </w:t>
-      </w:r>
-      <w:proofErr w:type="spellStart"/>
-      <w:r>
-        <w:t>jalankan</w:t>
-      </w:r>
-      <w:proofErr w:type="spellEnd"/>
-      <w:r>
-        <w:t xml:space="preserve"> local </w:t>
-      </w:r>
-      <w:proofErr w:type="spellStart"/>
-      <w:r>
-        <w:t>servernya</w:t>
-      </w:r>
-      <w:proofErr w:type="spellEnd"/>
-    </w:p>
-    <w:p>
-      <w:proofErr w:type="spellStart"/>
-      <w:r>
-        <w:t>Koneksi</w:t>
-      </w:r>
-      <w:proofErr w:type="spellEnd"/>
-      <w:r>
-        <w:t xml:space="preserve"> </w:t>
-      </w:r>
-      <w:proofErr w:type="spellStart"/>
-      <w:r>
-        <w:t>monodb</w:t>
-      </w:r>
-      <w:proofErr w:type="spellEnd"/>
-    </w:p>
-    <w:p>
-      <w:proofErr w:type="spellStart"/>
-      <w:r>
-        <w:t>Pilih</w:t>
-      </w:r>
-      <w:proofErr w:type="spellEnd"/>
-      <w:r>
-        <w:t xml:space="preserve"> connect pada </w:t>
-      </w:r>
-      <w:proofErr w:type="spellStart"/>
-      <w:r>
-        <w:t>cluser</w:t>
-      </w:r>
-      <w:proofErr w:type="spellEnd"/>
-      <w:r>
-        <w:t xml:space="preserve"> </w:t>
-      </w:r>
-      <w:proofErr w:type="spellStart"/>
-      <w:r>
-        <w:t>tertentu</w:t>
-      </w:r>
-      <w:proofErr w:type="spellEnd"/>
+        <w:t xml:space="preserve"> kemudian jalankan local servernya</w:t>
+      </w:r>
+    </w:p>
+    <w:p>
+      <w:r>
+        <w:t>Koneksi monodb</w:t>
+      </w:r>
+    </w:p>
+    <w:p>
+      <w:r>
+        <w:t>Pilih connect pada cluser tertentu</w:t>
+      </w:r>
     </w:p>
     <w:p>
       <w:r>
@@ -318,7 +241,7 @@
                     <pic:cNvPicPr/>
                   </pic:nvPicPr>
                   <pic:blipFill>
-                    <a:blip r:embed="rId7"/>
+                    <a:blip r:embed="rId8"/>
                     <a:stretch>
                       <a:fillRect/>
                     </a:stretch>
@@ -340,13 +263,8 @@
       </w:r>
     </w:p>
     <w:p>
-      <w:proofErr w:type="spellStart"/>
-      <w:r>
-        <w:t>Klik</w:t>
-      </w:r>
-      <w:proofErr w:type="spellEnd"/>
-      <w:r>
-        <w:t xml:space="preserve"> connect</w:t>
+      <w:r>
+        <w:t>Klik connect</w:t>
       </w:r>
     </w:p>
     <w:p>
@@ -370,7 +288,7 @@
                     <pic:cNvPicPr/>
                   </pic:nvPicPr>
                   <pic:blipFill>
-                    <a:blip r:embed="rId8"/>
+                    <a:blip r:embed="rId9"/>
                     <a:stretch>
                       <a:fillRect/>
                     </a:stretch>
@@ -393,21 +311,8 @@
     </w:p>
     <w:p>
       <w:r>
-        <w:t xml:space="preserve">Copas </w:t>
-      </w:r>
-      <w:proofErr w:type="spellStart"/>
-      <w:r>
-        <w:t>nomor</w:t>
-      </w:r>
-      <w:proofErr w:type="spellEnd"/>
-      <w:r>
-        <w:t xml:space="preserve"> 3 link mongo </w:t>
-      </w:r>
-      <w:proofErr w:type="spellStart"/>
-      <w:r>
-        <w:t>dbnya</w:t>
-      </w:r>
-      <w:proofErr w:type="spellEnd"/>
+        <w:t>Copas nomor 3 link mongo dbnya</w:t>
+      </w:r>
     </w:p>
     <w:p>
       <w:r>
@@ -430,7 +335,7 @@
                     <pic:cNvPicPr/>
                   </pic:nvPicPr>
                   <pic:blipFill>
-                    <a:blip r:embed="rId9"/>
+                    <a:blip r:embed="rId10"/>
                     <a:stretch>
                       <a:fillRect/>
                     </a:stretch>
@@ -453,37 +358,8 @@
     </w:p>
     <w:p>
       <w:r>
-        <w:t xml:space="preserve">Buat file config.js </w:t>
-      </w:r>
-      <w:proofErr w:type="spellStart"/>
-      <w:r>
-        <w:t>ubah</w:t>
-      </w:r>
-      <w:proofErr w:type="spellEnd"/>
-      <w:r>
-        <w:t xml:space="preserve"> tag </w:t>
-      </w:r>
-      <w:proofErr w:type="spellStart"/>
-      <w:r>
-        <w:t>db</w:t>
-      </w:r>
-      <w:proofErr w:type="spellEnd"/>
-      <w:r>
-        <w:t xml:space="preserve"> password </w:t>
-      </w:r>
-      <w:proofErr w:type="spellStart"/>
-      <w:r>
-        <w:t>menjadi</w:t>
-      </w:r>
-      <w:proofErr w:type="spellEnd"/>
-      <w:r>
-        <w:t xml:space="preserve"> password </w:t>
-      </w:r>
-      <w:proofErr w:type="spellStart"/>
-      <w:r>
-        <w:t>kalain</w:t>
-      </w:r>
-      <w:proofErr w:type="spellEnd"/>
+        <w:t>Buat file config.js ubah tag db password menjadi password kalain</w:t>
+      </w:r>
     </w:p>
     <w:p>
       <w:r>
@@ -541,61 +417,8 @@
       </w:r>
     </w:p>
     <w:p>
-      <w:proofErr w:type="spellStart"/>
-      <w:r>
-        <w:t>Pastikan</w:t>
-      </w:r>
-      <w:proofErr w:type="spellEnd"/>
-      <w:r>
-        <w:t xml:space="preserve"> </w:t>
-      </w:r>
-      <w:proofErr w:type="spellStart"/>
-      <w:r>
-        <w:t>uname</w:t>
-      </w:r>
-      <w:proofErr w:type="spellEnd"/>
-      <w:r>
-        <w:t xml:space="preserve"> </w:t>
-      </w:r>
-      <w:proofErr w:type="spellStart"/>
-      <w:r>
-        <w:t>db</w:t>
-      </w:r>
-      <w:proofErr w:type="spellEnd"/>
-      <w:r>
-        <w:t xml:space="preserve"> </w:t>
-      </w:r>
-      <w:proofErr w:type="spellStart"/>
-      <w:r>
-        <w:t>uname</w:t>
-      </w:r>
-      <w:proofErr w:type="spellEnd"/>
-      <w:r>
-        <w:t xml:space="preserve"> </w:t>
-      </w:r>
-      <w:proofErr w:type="spellStart"/>
-      <w:r>
-        <w:t>db</w:t>
-      </w:r>
-      <w:proofErr w:type="spellEnd"/>
-      <w:r>
-        <w:t xml:space="preserve"> nama cluster dan nama </w:t>
-      </w:r>
-      <w:proofErr w:type="spellStart"/>
-      <w:r>
-        <w:t>db</w:t>
-      </w:r>
-      <w:proofErr w:type="spellEnd"/>
-      <w:r>
-        <w:t xml:space="preserve"> </w:t>
-      </w:r>
-      <w:proofErr w:type="spellStart"/>
-      <w:r>
-        <w:t>benar</w:t>
-      </w:r>
-      <w:proofErr w:type="spellEnd"/>
-      <w:r>
-        <w:t xml:space="preserve"> </w:t>
+      <w:r>
+        <w:t xml:space="preserve">Pastikan uname db uname db nama cluster dan nama db benar </w:t>
       </w:r>
     </w:p>
     <w:p/>
@@ -613,13 +436,8 @@
     </w:p>
     <w:p>
       <w:r>
-        <w:t xml:space="preserve">Install </w:t>
-      </w:r>
-      <w:proofErr w:type="spellStart"/>
-      <w:r>
-        <w:t>nodemon</w:t>
-      </w:r>
-      <w:proofErr w:type="spellEnd"/>
+        <w:t>Install nodemon</w:t>
+      </w:r>
     </w:p>
     <w:p>
       <w:r>
@@ -642,7 +460,7 @@
                     <pic:cNvPicPr/>
                   </pic:nvPicPr>
                   <pic:blipFill>
-                    <a:blip r:embed="rId10"/>
+                    <a:blip r:embed="rId11"/>
                     <a:stretch>
                       <a:fillRect/>
                     </a:stretch>
@@ -665,29 +483,8 @@
     </w:p>
     <w:p>
       <w:r>
-        <w:t xml:space="preserve">Install </w:t>
-      </w:r>
-      <w:proofErr w:type="spellStart"/>
-      <w:r>
-        <w:t>bcrypt</w:t>
-      </w:r>
-      <w:proofErr w:type="spellEnd"/>
-      <w:r>
-        <w:t xml:space="preserve"> </w:t>
-      </w:r>
-      <w:proofErr w:type="spellStart"/>
-      <w:r>
-        <w:t>json</w:t>
-      </w:r>
-      <w:proofErr w:type="spellEnd"/>
-      <w:r>
-        <w:t xml:space="preserve"> </w:t>
-      </w:r>
-      <w:proofErr w:type="spellStart"/>
-      <w:r>
-        <w:t>webtoken</w:t>
-      </w:r>
-      <w:proofErr w:type="spellEnd"/>
+        <w:t>Install bcrypt json webtoken</w:t>
+      </w:r>
     </w:p>
     <w:p>
       <w:r>
@@ -710,7 +507,7 @@
                     <pic:cNvPicPr/>
                   </pic:nvPicPr>
                   <pic:blipFill>
-                    <a:blip r:embed="rId11"/>
+                    <a:blip r:embed="rId12"/>
                     <a:stretch>
                       <a:fillRect/>
                     </a:stretch>
@@ -792,49 +589,8 @@
                 <w:b/>
                 <w:bCs/>
               </w:rPr>
-              <w:t xml:space="preserve">Mutation: </w:t>
-            </w:r>
-            <w:proofErr w:type="spellStart"/>
-            <w:r>
-              <w:rPr>
-                <w:b/>
-                <w:bCs/>
-              </w:rPr>
-              <w:t>melakukan</w:t>
-            </w:r>
-            <w:proofErr w:type="spellEnd"/>
-            <w:r>
-              <w:rPr>
-                <w:b/>
-                <w:bCs/>
-              </w:rPr>
-              <w:t xml:space="preserve"> </w:t>
-            </w:r>
-            <w:proofErr w:type="spellStart"/>
-            <w:r>
-              <w:rPr>
-                <w:b/>
-                <w:bCs/>
-              </w:rPr>
-              <w:t>olah</w:t>
-            </w:r>
-            <w:proofErr w:type="spellEnd"/>
-            <w:r>
-              <w:rPr>
-                <w:b/>
-                <w:bCs/>
-              </w:rPr>
-              <w:t xml:space="preserve"> data di </w:t>
-            </w:r>
-            <w:proofErr w:type="spellStart"/>
-            <w:r>
-              <w:rPr>
-                <w:b/>
-                <w:bCs/>
-              </w:rPr>
-              <w:t>db</w:t>
-            </w:r>
-            <w:proofErr w:type="spellEnd"/>
+              <w:t>Mutation: melakukan olah data di db</w:t>
+            </w:r>
           </w:p>
           <w:p>
             <w:pPr>
@@ -848,33 +604,8 @@
                 <w:b/>
                 <w:bCs/>
               </w:rPr>
-              <w:t xml:space="preserve">Query: </w:t>
-            </w:r>
-            <w:proofErr w:type="spellStart"/>
-            <w:r>
-              <w:rPr>
-                <w:b/>
-                <w:bCs/>
-              </w:rPr>
-              <w:t>melakukan</w:t>
-            </w:r>
-            <w:proofErr w:type="spellEnd"/>
-            <w:r>
-              <w:rPr>
-                <w:b/>
-                <w:bCs/>
-              </w:rPr>
-              <w:t xml:space="preserve"> fetch data di </w:t>
-            </w:r>
-            <w:proofErr w:type="spellStart"/>
-            <w:r>
-              <w:rPr>
-                <w:b/>
-                <w:bCs/>
-              </w:rPr>
-              <w:t>db</w:t>
-            </w:r>
-            <w:proofErr w:type="spellEnd"/>
+              <w:t>Query: melakukan fetch data di db</w:t>
+            </w:r>
           </w:p>
         </w:tc>
       </w:tr>
@@ -913,7 +644,6 @@
                 <w:bCs/>
               </w:rPr>
             </w:pPr>
-            <w:proofErr w:type="spellStart"/>
             <w:r>
               <w:rPr>
                 <w:b/>
@@ -921,7 +651,6 @@
               </w:rPr>
               <w:t>Keterangan</w:t>
             </w:r>
-            <w:proofErr w:type="spellEnd"/>
           </w:p>
         </w:tc>
       </w:tr>
@@ -937,7 +666,6 @@
                 <w:bCs/>
               </w:rPr>
             </w:pPr>
-            <w:proofErr w:type="spellStart"/>
             <w:r>
               <w:rPr>
                 <w:b/>
@@ -945,7 +673,6 @@
               </w:rPr>
               <w:t>graphql</w:t>
             </w:r>
-            <w:proofErr w:type="spellEnd"/>
           </w:p>
         </w:tc>
         <w:tc>
@@ -976,31 +703,10 @@
               </w:numPr>
             </w:pPr>
             <w:r>
-              <w:t xml:space="preserve">Index.js </w:t>
-            </w:r>
-            <w:proofErr w:type="gramStart"/>
-            <w:r>
-              <w:t xml:space="preserve">=  </w:t>
-            </w:r>
-            <w:proofErr w:type="spellStart"/>
-            <w:r>
-              <w:t>menampung</w:t>
-            </w:r>
-            <w:proofErr w:type="spellEnd"/>
-            <w:proofErr w:type="gramEnd"/>
-            <w:r>
-              <w:t xml:space="preserve"> </w:t>
-            </w:r>
-            <w:r>
-              <w:t xml:space="preserve">posts (query) dan users </w:t>
-            </w:r>
-            <w:proofErr w:type="spellStart"/>
-            <w:r>
-              <w:t>js</w:t>
-            </w:r>
-            <w:proofErr w:type="spellEnd"/>
-            <w:r>
-              <w:t xml:space="preserve"> </w:t>
+              <w:t xml:space="preserve">Index.js =  menampung </w:t>
+            </w:r>
+            <w:r>
+              <w:t xml:space="preserve">posts (query) dan users js </w:t>
             </w:r>
             <w:r>
               <w:t>(mutation)</w:t>
@@ -1014,29 +720,8 @@
                 <w:numId w:val="2"/>
               </w:numPr>
             </w:pPr>
-            <w:proofErr w:type="spellStart"/>
-            <w:r>
-              <w:t>Diikuti</w:t>
-            </w:r>
-            <w:proofErr w:type="spellEnd"/>
-            <w:r>
-              <w:t xml:space="preserve"> </w:t>
-            </w:r>
-            <w:proofErr w:type="spellStart"/>
-            <w:r>
-              <w:t>perantara</w:t>
-            </w:r>
-            <w:proofErr w:type="spellEnd"/>
-            <w:r>
-              <w:t xml:space="preserve"> logic </w:t>
-            </w:r>
-            <w:proofErr w:type="spellStart"/>
-            <w:r>
-              <w:t>dengan</w:t>
-            </w:r>
-            <w:proofErr w:type="spellEnd"/>
-            <w:r>
-              <w:t xml:space="preserve"> model:</w:t>
+            <w:r>
+              <w:t>Diikuti perantara logic dengan model:</w:t>
             </w:r>
           </w:p>
           <w:p>
@@ -1048,23 +733,7 @@
               </w:numPr>
             </w:pPr>
             <w:r>
-              <w:t xml:space="preserve">user.js = logic yang </w:t>
-            </w:r>
-            <w:proofErr w:type="spellStart"/>
-            <w:r>
-              <w:t>menghubungkan</w:t>
-            </w:r>
-            <w:proofErr w:type="spellEnd"/>
-            <w:r>
-              <w:t xml:space="preserve"> </w:t>
-            </w:r>
-            <w:proofErr w:type="spellStart"/>
-            <w:r>
-              <w:t>ke</w:t>
-            </w:r>
-            <w:proofErr w:type="spellEnd"/>
-            <w:r>
-              <w:t xml:space="preserve"> model User</w:t>
+              <w:t>user.js = logic yang menghubungkan ke model User</w:t>
             </w:r>
           </w:p>
           <w:p>
@@ -1073,47 +742,7 @@
               <w:ind w:left="1080"/>
             </w:pPr>
             <w:r>
-              <w:t xml:space="preserve">di </w:t>
-            </w:r>
-            <w:proofErr w:type="spellStart"/>
-            <w:r>
-              <w:t>dalamnya</w:t>
-            </w:r>
-            <w:proofErr w:type="spellEnd"/>
-            <w:r>
-              <w:t xml:space="preserve"> </w:t>
-            </w:r>
-            <w:proofErr w:type="spellStart"/>
-            <w:r>
-              <w:t>berupa</w:t>
-            </w:r>
-            <w:proofErr w:type="spellEnd"/>
-            <w:r>
-              <w:t xml:space="preserve"> resolvers </w:t>
-            </w:r>
-            <w:proofErr w:type="spellStart"/>
-            <w:r>
-              <w:t>ada</w:t>
-            </w:r>
-            <w:proofErr w:type="spellEnd"/>
-            <w:r>
-              <w:t xml:space="preserve"> </w:t>
-            </w:r>
-            <w:proofErr w:type="spellStart"/>
-            <w:r>
-              <w:t>logicnya</w:t>
-            </w:r>
-            <w:proofErr w:type="spellEnd"/>
-            <w:r>
-              <w:t xml:space="preserve"> </w:t>
-            </w:r>
-            <w:proofErr w:type="spellStart"/>
-            <w:r>
-              <w:t>bisa</w:t>
-            </w:r>
-            <w:proofErr w:type="spellEnd"/>
-            <w:r>
-              <w:t xml:space="preserve"> query</w:t>
+              <w:t>di dalamnya berupa resolvers ada logicnya bisa query</w:t>
             </w:r>
           </w:p>
           <w:p>
@@ -1125,23 +754,7 @@
               </w:numPr>
             </w:pPr>
             <w:r>
-              <w:t xml:space="preserve">post.js = logic yang </w:t>
-            </w:r>
-            <w:proofErr w:type="spellStart"/>
-            <w:r>
-              <w:t>menghubungkan</w:t>
-            </w:r>
-            <w:proofErr w:type="spellEnd"/>
-            <w:r>
-              <w:t xml:space="preserve"> </w:t>
-            </w:r>
-            <w:proofErr w:type="spellStart"/>
-            <w:r>
-              <w:t>ke</w:t>
-            </w:r>
-            <w:proofErr w:type="spellEnd"/>
-            <w:r>
-              <w:t xml:space="preserve"> model Post</w:t>
+              <w:t>post.js = logic yang menghubungkan ke model Post</w:t>
             </w:r>
           </w:p>
           <w:p>
@@ -1150,51 +763,10 @@
               <w:ind w:left="1080"/>
             </w:pPr>
             <w:r>
-              <w:t xml:space="preserve">di </w:t>
-            </w:r>
-            <w:proofErr w:type="spellStart"/>
-            <w:r>
-              <w:t>dalamnya</w:t>
-            </w:r>
-            <w:proofErr w:type="spellEnd"/>
-            <w:r>
-              <w:t xml:space="preserve"> </w:t>
-            </w:r>
-            <w:proofErr w:type="spellStart"/>
-            <w:r>
-              <w:t>berupa</w:t>
-            </w:r>
-            <w:proofErr w:type="spellEnd"/>
-            <w:r>
-              <w:t xml:space="preserve"> resolvers </w:t>
-            </w:r>
-            <w:proofErr w:type="spellStart"/>
-            <w:r>
-              <w:t>ada</w:t>
-            </w:r>
-            <w:proofErr w:type="spellEnd"/>
-            <w:r>
-              <w:t xml:space="preserve"> </w:t>
-            </w:r>
-            <w:proofErr w:type="spellStart"/>
-            <w:r>
-              <w:t>logicnya</w:t>
-            </w:r>
-            <w:proofErr w:type="spellEnd"/>
-            <w:r>
-              <w:t xml:space="preserve"> </w:t>
-            </w:r>
-            <w:proofErr w:type="spellStart"/>
-            <w:r>
-              <w:t>bisa</w:t>
-            </w:r>
-            <w:proofErr w:type="spellEnd"/>
-            <w:r>
-              <w:t xml:space="preserve"> mutation</w:t>
-            </w:r>
-          </w:p>
-          <w:p>
-            <w:proofErr w:type="spellStart"/>
+              <w:t>di dalamnya berupa resolvers ada logicnya bisa mutation</w:t>
+            </w:r>
+          </w:p>
+          <w:p>
             <w:r>
               <w:rPr>
                 <w:b/>
@@ -1202,7 +774,6 @@
               </w:rPr>
               <w:t>TypeDefs</w:t>
             </w:r>
-            <w:proofErr w:type="spellEnd"/>
             <w:r>
               <w:t>:</w:t>
             </w:r>
@@ -1212,77 +783,8 @@
               <w:t xml:space="preserve">  </w:t>
             </w:r>
             <w:r>
-              <w:t xml:space="preserve">Adalah </w:t>
-            </w:r>
-            <w:proofErr w:type="spellStart"/>
-            <w:r>
-              <w:t>sekumpulan</w:t>
-            </w:r>
-            <w:proofErr w:type="spellEnd"/>
-            <w:r>
-              <w:t xml:space="preserve"> schema </w:t>
-            </w:r>
-            <w:proofErr w:type="spellStart"/>
-            <w:r>
-              <w:t>atau</w:t>
-            </w:r>
-            <w:proofErr w:type="spellEnd"/>
-            <w:r>
-              <w:t xml:space="preserve"> blueprint </w:t>
-            </w:r>
-            <w:proofErr w:type="spellStart"/>
-            <w:r>
-              <w:t>yg</w:t>
-            </w:r>
-            <w:proofErr w:type="spellEnd"/>
-            <w:r>
-              <w:t xml:space="preserve"> </w:t>
-            </w:r>
-            <w:proofErr w:type="spellStart"/>
-            <w:r>
-              <w:t>dapat</w:t>
-            </w:r>
-            <w:proofErr w:type="spellEnd"/>
-            <w:r>
-              <w:t xml:space="preserve"> </w:t>
-            </w:r>
-            <w:proofErr w:type="spellStart"/>
-            <w:r>
-              <w:t>langsung</w:t>
-            </w:r>
-            <w:proofErr w:type="spellEnd"/>
-            <w:r>
-              <w:t xml:space="preserve"> </w:t>
-            </w:r>
-            <w:proofErr w:type="spellStart"/>
-            <w:r>
-              <w:t>digunakan</w:t>
-            </w:r>
-            <w:proofErr w:type="spellEnd"/>
-            <w:r>
-              <w:t xml:space="preserve"> di apollo    server kiri typedefs pada </w:t>
-            </w:r>
-            <w:proofErr w:type="spellStart"/>
-            <w:r>
-              <w:t>vscode</w:t>
-            </w:r>
-            <w:proofErr w:type="spellEnd"/>
-            <w:r>
-              <w:t xml:space="preserve"> </w:t>
-            </w:r>
-            <w:proofErr w:type="spellStart"/>
-            <w:r>
-              <w:t>kanan</w:t>
-            </w:r>
-            <w:proofErr w:type="spellEnd"/>
-            <w:r>
-              <w:t xml:space="preserve"> </w:t>
-            </w:r>
-            <w:proofErr w:type="spellStart"/>
-            <w:r>
-              <w:t>schemanya</w:t>
-            </w:r>
-            <w:proofErr w:type="spellEnd"/>
+              <w:t>Adalah sekumpulan schema atau blueprint yg dapat langsung digunakan di apollo    server kiri typedefs pada vscode kanan schemanya</w:t>
+            </w:r>
           </w:p>
           <w:p>
             <w:r>
@@ -1305,7 +807,7 @@
                           <pic:cNvPicPr/>
                         </pic:nvPicPr>
                         <pic:blipFill>
-                          <a:blip r:embed="rId12"/>
+                          <a:blip r:embed="rId13"/>
                           <a:stretch>
                             <a:fillRect/>
                           </a:stretch>
@@ -1345,7 +847,7 @@
                           <pic:cNvPicPr/>
                         </pic:nvPicPr>
                         <pic:blipFill>
-                          <a:blip r:embed="rId13"/>
+                          <a:blip r:embed="rId14"/>
                           <a:stretch>
                             <a:fillRect/>
                           </a:stretch>
@@ -1395,61 +897,11 @@
             <w:tcW w:w="8019" w:type="dxa"/>
           </w:tcPr>
           <w:p>
-            <w:proofErr w:type="spellStart"/>
-            <w:r>
-              <w:t>Menentukan</w:t>
-            </w:r>
-            <w:proofErr w:type="spellEnd"/>
-            <w:r>
-              <w:t xml:space="preserve"> field </w:t>
-            </w:r>
-            <w:proofErr w:type="spellStart"/>
-            <w:r>
-              <w:t>apa</w:t>
-            </w:r>
-            <w:proofErr w:type="spellEnd"/>
-            <w:r>
-              <w:t xml:space="preserve"> </w:t>
-            </w:r>
-            <w:proofErr w:type="spellStart"/>
-            <w:r>
-              <w:t>saja</w:t>
-            </w:r>
-            <w:proofErr w:type="spellEnd"/>
-            <w:r>
-              <w:t xml:space="preserve"> pada collection di mongo </w:t>
-            </w:r>
-            <w:proofErr w:type="spellStart"/>
-            <w:r>
-              <w:t>db</w:t>
-            </w:r>
-            <w:proofErr w:type="spellEnd"/>
-            <w:r>
-              <w:t xml:space="preserve"> </w:t>
-            </w:r>
-            <w:proofErr w:type="spellStart"/>
-            <w:r>
-              <w:t>beserta</w:t>
-            </w:r>
-            <w:proofErr w:type="spellEnd"/>
-            <w:r>
-              <w:t xml:space="preserve"> </w:t>
-            </w:r>
-            <w:proofErr w:type="spellStart"/>
-            <w:r>
-              <w:t>relasi</w:t>
-            </w:r>
-            <w:proofErr w:type="spellEnd"/>
-            <w:r>
-              <w:t xml:space="preserve"> </w:t>
-            </w:r>
-            <w:proofErr w:type="spellStart"/>
-            <w:r>
-              <w:t>antar</w:t>
-            </w:r>
-            <w:proofErr w:type="spellEnd"/>
-            <w:r>
-              <w:t xml:space="preserve"> model</w:t>
+            <w:r>
+              <w:t>Menentukan field apa saja pada collection di mongo db</w:t>
+            </w:r>
+            <w:r>
+              <w:t xml:space="preserve"> beserta relasi antar model</w:t>
             </w:r>
           </w:p>
         </w:tc>
@@ -1480,85 +932,8 @@
             <w:tcW w:w="8019" w:type="dxa"/>
           </w:tcPr>
           <w:p>
-            <w:proofErr w:type="spellStart"/>
-            <w:r>
-              <w:t>Menentukan</w:t>
-            </w:r>
-            <w:proofErr w:type="spellEnd"/>
-            <w:r>
-              <w:t xml:space="preserve"> </w:t>
-            </w:r>
-            <w:proofErr w:type="spellStart"/>
-            <w:r>
-              <w:t>validasi</w:t>
-            </w:r>
-            <w:proofErr w:type="spellEnd"/>
-            <w:r>
-              <w:t xml:space="preserve"> </w:t>
-            </w:r>
-            <w:proofErr w:type="spellStart"/>
-            <w:r>
-              <w:t>dari</w:t>
-            </w:r>
-            <w:proofErr w:type="spellEnd"/>
-            <w:r>
-              <w:t xml:space="preserve"> </w:t>
-            </w:r>
-            <w:proofErr w:type="spellStart"/>
-            <w:r>
-              <w:t>awal</w:t>
-            </w:r>
-            <w:proofErr w:type="spellEnd"/>
-            <w:r>
-              <w:t xml:space="preserve"> </w:t>
-            </w:r>
-            <w:proofErr w:type="spellStart"/>
-            <w:r>
-              <w:t>hingga</w:t>
-            </w:r>
-            <w:proofErr w:type="spellEnd"/>
-            <w:r>
-              <w:t xml:space="preserve"> </w:t>
-            </w:r>
-            <w:proofErr w:type="spellStart"/>
-            <w:r>
-              <w:t>akhir</w:t>
-            </w:r>
-            <w:proofErr w:type="spellEnd"/>
-            <w:r>
-              <w:t xml:space="preserve">. Atau </w:t>
-            </w:r>
-            <w:proofErr w:type="spellStart"/>
-            <w:r>
-              <w:t>utilitas</w:t>
-            </w:r>
-            <w:proofErr w:type="spellEnd"/>
-            <w:r>
-              <w:t xml:space="preserve"> </w:t>
-            </w:r>
-            <w:proofErr w:type="spellStart"/>
-            <w:r>
-              <w:t>lainnya</w:t>
-            </w:r>
-            <w:proofErr w:type="spellEnd"/>
-            <w:r>
-              <w:t xml:space="preserve">, </w:t>
-            </w:r>
-            <w:proofErr w:type="spellStart"/>
-            <w:r>
-              <w:t>digunakan</w:t>
-            </w:r>
-            <w:proofErr w:type="spellEnd"/>
-            <w:r>
-              <w:t xml:space="preserve"> </w:t>
-            </w:r>
-            <w:proofErr w:type="spellStart"/>
-            <w:r>
-              <w:t>dalam</w:t>
-            </w:r>
-            <w:proofErr w:type="spellEnd"/>
-            <w:r>
-              <w:t xml:space="preserve"> resolver</w:t>
+            <w:r>
+              <w:t>Menentukan validasi dari awal hingga akhir. Atau utilitas lainnya, digunakan dalam resolver</w:t>
             </w:r>
           </w:p>
         </w:tc>
@@ -1589,19 +964,9 @@
             <w:tcW w:w="8019" w:type="dxa"/>
           </w:tcPr>
           <w:p>
-            <w:proofErr w:type="spellStart"/>
-            <w:r>
-              <w:t>Untuk</w:t>
-            </w:r>
-            <w:proofErr w:type="spellEnd"/>
-            <w:r>
-              <w:t xml:space="preserve"> </w:t>
-            </w:r>
-            <w:proofErr w:type="spellStart"/>
-            <w:r>
-              <w:t>koneski</w:t>
-            </w:r>
-            <w:proofErr w:type="spellEnd"/>
+            <w:r>
+              <w:t>Untuk koneski</w:t>
+            </w:r>
           </w:p>
         </w:tc>
       </w:tr>
@@ -1632,45 +997,8 @@
           </w:tcPr>
           <w:p>
             <w:r>
-              <w:t xml:space="preserve">Integrasi resolvers dan typedefs pada apollo server agar </w:t>
-            </w:r>
-            <w:proofErr w:type="spellStart"/>
-            <w:r>
-              <w:t>melalui</w:t>
-            </w:r>
-            <w:proofErr w:type="spellEnd"/>
-            <w:r>
-              <w:t xml:space="preserve"> server </w:t>
-            </w:r>
-            <w:proofErr w:type="spellStart"/>
-            <w:r>
-              <w:t>tersebut</w:t>
-            </w:r>
-            <w:proofErr w:type="spellEnd"/>
-            <w:r>
-              <w:t xml:space="preserve"> </w:t>
-            </w:r>
-            <w:proofErr w:type="spellStart"/>
-            <w:r>
-              <w:t>bisa</w:t>
-            </w:r>
-            <w:proofErr w:type="spellEnd"/>
-            <w:r>
-              <w:t xml:space="preserve"> </w:t>
-            </w:r>
-            <w:proofErr w:type="spellStart"/>
-            <w:r>
-              <w:t>diutak</w:t>
-            </w:r>
-            <w:proofErr w:type="spellEnd"/>
-            <w:r>
-              <w:t xml:space="preserve"> </w:t>
-            </w:r>
-            <w:proofErr w:type="spellStart"/>
-            <w:r>
-              <w:t>atik</w:t>
-            </w:r>
-            <w:proofErr w:type="spellEnd"/>
+              <w:t>Integrasi resolvers dan typedefs pada apollo server agar melalui server tersebut bisa diutak atik</w:t>
+            </w:r>
           </w:p>
         </w:tc>
       </w:tr>
@@ -1716,7 +1044,7 @@
                     <pic:cNvPicPr/>
                   </pic:nvPicPr>
                   <pic:blipFill>
-                    <a:blip r:embed="rId14"/>
+                    <a:blip r:embed="rId15"/>
                     <a:stretch>
                       <a:fillRect/>
                     </a:stretch>
@@ -1758,7 +1086,7 @@
                     <pic:cNvPicPr/>
                   </pic:nvPicPr>
                   <pic:blipFill>
-                    <a:blip r:embed="rId15"/>
+                    <a:blip r:embed="rId16"/>
                     <a:stretch>
                       <a:fillRect/>
                     </a:stretch>
@@ -1781,46 +1109,12 @@
     </w:p>
     <w:p>
       <w:r>
-        <w:t xml:space="preserve">No 2 </w:t>
-      </w:r>
-      <w:proofErr w:type="spellStart"/>
-      <w:r>
-        <w:t>lihat</w:t>
-      </w:r>
-      <w:proofErr w:type="spellEnd"/>
-      <w:r>
-        <w:t xml:space="preserve"> file </w:t>
-      </w:r>
-      <w:proofErr w:type="spellStart"/>
-      <w:r>
-        <w:t>serviceworker</w:t>
-      </w:r>
-      <w:proofErr w:type="spellEnd"/>
-      <w:r>
-        <w:t xml:space="preserve"> </w:t>
-      </w:r>
-      <w:proofErr w:type="spellStart"/>
-      <w:r>
-        <w:t>js</w:t>
-      </w:r>
-      <w:proofErr w:type="spellEnd"/>
-    </w:p>
-    <w:p>
-      <w:proofErr w:type="spellStart"/>
-      <w:r>
-        <w:t>Tambahkan</w:t>
-      </w:r>
-      <w:proofErr w:type="spellEnd"/>
-      <w:r>
-        <w:t xml:space="preserve"> di package </w:t>
-      </w:r>
-      <w:proofErr w:type="spellStart"/>
-      <w:r>
-        <w:t>json</w:t>
-      </w:r>
-      <w:proofErr w:type="spellEnd"/>
-      <w:r>
-        <w:t>, serve: node index</w:t>
+        <w:t>No 2 lihat file serviceworker js</w:t>
+      </w:r>
+    </w:p>
+    <w:p>
+      <w:r>
+        <w:t>Tambahkan di package json, serve: node index</w:t>
       </w:r>
     </w:p>
     <w:p>
@@ -1844,7 +1138,7 @@
                     <pic:cNvPicPr/>
                   </pic:nvPicPr>
                   <pic:blipFill>
-                    <a:blip r:embed="rId16"/>
+                    <a:blip r:embed="rId17"/>
                     <a:stretch>
                       <a:fillRect/>
                     </a:stretch>
@@ -1866,13 +1160,8 @@
       </w:r>
     </w:p>
     <w:p>
-      <w:proofErr w:type="spellStart"/>
-      <w:r>
-        <w:t>npm</w:t>
-      </w:r>
-      <w:proofErr w:type="spellEnd"/>
-      <w:r>
-        <w:t xml:space="preserve"> install @apollo/react-hooks@0.1.0-beta.7 apollo-cache-inmemory@1.6.2 apollo-client@2.6.2 apollo-link-http@1.5.14 graphql@14.3.1 --save-exact --legacy-peer-deps</w:t>
+      <w:r>
+        <w:t>npm install @apollo/react-hooks@0.1.0-beta.7 apollo-cache-inmemory@1.6.2 apollo-client@2.6.2 apollo-link-http@1.5.14 graphql@14.3.1 --save-exact --legacy-peer-deps</w:t>
       </w:r>
     </w:p>
     <w:p>
@@ -1881,85 +1170,8 @@
       </w:r>
     </w:p>
     <w:p>
-      <w:proofErr w:type="spellStart"/>
-      <w:r>
-        <w:t>hasil</w:t>
-      </w:r>
-      <w:proofErr w:type="spellEnd"/>
-      <w:r>
-        <w:t xml:space="preserve"> </w:t>
-      </w:r>
-      <w:proofErr w:type="spellStart"/>
-      <w:r>
-        <w:t>akhir</w:t>
-      </w:r>
-      <w:proofErr w:type="spellEnd"/>
-      <w:r>
-        <w:t xml:space="preserve"> </w:t>
-      </w:r>
-      <w:proofErr w:type="spellStart"/>
-      <w:r>
-        <w:t>pastikan</w:t>
-      </w:r>
-      <w:proofErr w:type="spellEnd"/>
-      <w:r>
-        <w:t xml:space="preserve"> </w:t>
-      </w:r>
-      <w:proofErr w:type="spellStart"/>
-      <w:r>
-        <w:t>struktur</w:t>
-      </w:r>
-      <w:proofErr w:type="spellEnd"/>
-      <w:r>
-        <w:t xml:space="preserve"> </w:t>
-      </w:r>
-      <w:proofErr w:type="spellStart"/>
-      <w:r>
-        <w:t>foldernya</w:t>
-      </w:r>
-      <w:proofErr w:type="spellEnd"/>
-      <w:r>
-        <w:t xml:space="preserve"> </w:t>
-      </w:r>
-      <w:proofErr w:type="spellStart"/>
-      <w:r>
-        <w:t>psrti</w:t>
-      </w:r>
-      <w:proofErr w:type="spellEnd"/>
-      <w:r>
-        <w:t xml:space="preserve"> </w:t>
-      </w:r>
-      <w:proofErr w:type="spellStart"/>
-      <w:r>
-        <w:t>ini</w:t>
-      </w:r>
-      <w:proofErr w:type="spellEnd"/>
-      <w:r>
-        <w:t xml:space="preserve"> (hapus </w:t>
-      </w:r>
-      <w:proofErr w:type="spellStart"/>
-      <w:r>
-        <w:t>yg</w:t>
-      </w:r>
-      <w:proofErr w:type="spellEnd"/>
-      <w:r>
-        <w:t xml:space="preserve"> </w:t>
-      </w:r>
-      <w:proofErr w:type="spellStart"/>
-      <w:r>
-        <w:t>tidak</w:t>
-      </w:r>
-      <w:proofErr w:type="spellEnd"/>
-      <w:r>
-        <w:t xml:space="preserve"> </w:t>
-      </w:r>
-      <w:proofErr w:type="spellStart"/>
-      <w:r>
-        <w:t>penitng</w:t>
-      </w:r>
-      <w:proofErr w:type="spellEnd"/>
-      <w:r>
-        <w:t>)</w:t>
+      <w:r>
+        <w:t>hasil akhir pastikan struktur foldernya psrti ini (hapus yg tidak penitng)</w:t>
       </w:r>
     </w:p>
     <w:p>
@@ -1983,7 +1195,7 @@
                     <pic:cNvPicPr/>
                   </pic:nvPicPr>
                   <pic:blipFill>
-                    <a:blip r:embed="rId17"/>
+                    <a:blip r:embed="rId18"/>
                     <a:stretch>
                       <a:fillRect/>
                     </a:stretch>
@@ -2014,36 +1226,15 @@
     </w:p>
     <w:p>
       <w:r>
-        <w:t xml:space="preserve">Install </w:t>
-      </w:r>
-      <w:proofErr w:type="spellStart"/>
-      <w:r>
-        <w:t>dulu</w:t>
-      </w:r>
-      <w:r>
-        <w:t>masuk</w:t>
-      </w:r>
-      <w:proofErr w:type="spellEnd"/>
-      <w:r>
-        <w:t xml:space="preserve"> </w:t>
-      </w:r>
-      <w:proofErr w:type="spellStart"/>
-      <w:r>
-        <w:t>ke</w:t>
-      </w:r>
-      <w:proofErr w:type="spellEnd"/>
-      <w:r>
-        <w:t xml:space="preserve"> folder client</w:t>
-      </w:r>
-    </w:p>
-    <w:p>
-      <w:proofErr w:type="spellStart"/>
-      <w:r>
-        <w:t>npm</w:t>
-      </w:r>
-      <w:proofErr w:type="spellEnd"/>
-      <w:r>
-        <w:t xml:space="preserve"> install react-router-dom@5.1.2 semantic-ui-css@2.4.1 semantic-ui-react@0.88.1 --save-exact --legacy-peer-deps</w:t>
+        <w:t>Install dulu</w:t>
+      </w:r>
+      <w:r>
+        <w:t>masuk ke folder client</w:t>
+      </w:r>
+    </w:p>
+    <w:p>
+      <w:r>
+        <w:t>npm install react-router-dom@5.1.2 semantic-ui-css@2.4.1 semantic-ui-react@0.88.1 --save-exact --legacy-peer-deps</w:t>
       </w:r>
     </w:p>
     <w:tbl>
@@ -2062,11 +1253,9 @@
             <w:tcW w:w="4508" w:type="dxa"/>
           </w:tcPr>
           <w:p>
-            <w:proofErr w:type="spellStart"/>
             <w:r>
               <w:t>Komponen</w:t>
             </w:r>
-            <w:proofErr w:type="spellEnd"/>
           </w:p>
         </w:tc>
         <w:tc>
@@ -2074,11 +1263,9 @@
             <w:tcW w:w="4508" w:type="dxa"/>
           </w:tcPr>
           <w:p>
-            <w:proofErr w:type="spellStart"/>
             <w:r>
               <w:t>Penjelasan</w:t>
             </w:r>
-            <w:proofErr w:type="spellEnd"/>
           </w:p>
         </w:tc>
       </w:tr>
@@ -2088,13 +1275,8 @@
             <w:tcW w:w="4508" w:type="dxa"/>
           </w:tcPr>
           <w:p>
-            <w:proofErr w:type="spellStart"/>
-            <w:r>
-              <w:t>Src</w:t>
-            </w:r>
-            <w:proofErr w:type="spellEnd"/>
-            <w:r>
-              <w:t>/component</w:t>
+            <w:r>
+              <w:t>Src/component</w:t>
             </w:r>
           </w:p>
         </w:tc>
@@ -2103,29 +1285,8 @@
             <w:tcW w:w="4508" w:type="dxa"/>
           </w:tcPr>
           <w:p>
-            <w:proofErr w:type="spellStart"/>
-            <w:r>
-              <w:t>Komponen</w:t>
-            </w:r>
-            <w:proofErr w:type="spellEnd"/>
-            <w:r>
-              <w:t xml:space="preserve"> </w:t>
-            </w:r>
-            <w:proofErr w:type="spellStart"/>
-            <w:r>
-              <w:t>dari</w:t>
-            </w:r>
-            <w:proofErr w:type="spellEnd"/>
-            <w:r>
-              <w:t xml:space="preserve"> </w:t>
-            </w:r>
-            <w:proofErr w:type="spellStart"/>
-            <w:r>
-              <w:t>tampilan</w:t>
-            </w:r>
-            <w:proofErr w:type="spellEnd"/>
-            <w:r>
-              <w:t xml:space="preserve"> web</w:t>
+            <w:r>
+              <w:t>Komponen dari tampilan web</w:t>
             </w:r>
           </w:p>
         </w:tc>
@@ -2136,13 +1297,8 @@
             <w:tcW w:w="4508" w:type="dxa"/>
           </w:tcPr>
           <w:p>
-            <w:proofErr w:type="spellStart"/>
-            <w:r>
-              <w:t>Src</w:t>
-            </w:r>
-            <w:proofErr w:type="spellEnd"/>
-            <w:r>
-              <w:t>/pages</w:t>
+            <w:r>
+              <w:t>Src/pages</w:t>
             </w:r>
           </w:p>
         </w:tc>
@@ -2152,13 +1308,8 @@
           </w:tcPr>
           <w:p>
             <w:r>
-              <w:t xml:space="preserve">Halaman </w:t>
-            </w:r>
-            <w:proofErr w:type="spellStart"/>
-            <w:r>
-              <w:t>webnya</w:t>
-            </w:r>
-            <w:proofErr w:type="spellEnd"/>
+              <w:t>Halaman webnya</w:t>
+            </w:r>
           </w:p>
         </w:tc>
       </w:tr>
@@ -2178,35 +1329,9 @@
             <w:tcW w:w="4508" w:type="dxa"/>
           </w:tcPr>
           <w:p>
-            <w:proofErr w:type="spellStart"/>
-            <w:r>
-              <w:t>Meload</w:t>
-            </w:r>
-            <w:proofErr w:type="spellEnd"/>
-            <w:r>
-              <w:t xml:space="preserve"> </w:t>
-            </w:r>
-            <w:proofErr w:type="spellStart"/>
-            <w:r>
-              <w:t>komponen</w:t>
-            </w:r>
-            <w:proofErr w:type="spellEnd"/>
-            <w:r>
-              <w:t xml:space="preserve"> </w:t>
-            </w:r>
-            <w:proofErr w:type="spellStart"/>
-            <w:r>
-              <w:t>beserta</w:t>
-            </w:r>
-            <w:proofErr w:type="spellEnd"/>
-            <w:r>
-              <w:t xml:space="preserve"> </w:t>
-            </w:r>
-            <w:proofErr w:type="spellStart"/>
-            <w:r>
-              <w:t>routingnya</w:t>
-            </w:r>
-            <w:proofErr w:type="spellEnd"/>
+            <w:r>
+              <w:t>Meload komponen beserta routingnya</w:t>
+            </w:r>
           </w:p>
         </w:tc>
       </w:tr>
@@ -2216,72 +1341,23 @@
       <w:pPr>
         <w:pStyle w:val="Heading2"/>
       </w:pPr>
-      <w:proofErr w:type="spellStart"/>
-      <w:r>
-        <w:t>Menampilkan</w:t>
-      </w:r>
-      <w:proofErr w:type="spellEnd"/>
-      <w:r>
-        <w:t xml:space="preserve"> post</w:t>
-      </w:r>
-    </w:p>
-    <w:p>
-      <w:proofErr w:type="spellStart"/>
-      <w:r>
-        <w:t>Mengambil</w:t>
-      </w:r>
-      <w:proofErr w:type="spellEnd"/>
-      <w:r>
-        <w:t xml:space="preserve"> data post </w:t>
-      </w:r>
-      <w:proofErr w:type="spellStart"/>
-      <w:r>
-        <w:t>dari</w:t>
-      </w:r>
-      <w:proofErr w:type="spellEnd"/>
-      <w:r>
-        <w:t xml:space="preserve"> </w:t>
-      </w:r>
-      <w:proofErr w:type="spellStart"/>
-      <w:r>
-        <w:t>mongodb</w:t>
-      </w:r>
-      <w:proofErr w:type="spellEnd"/>
-    </w:p>
-    <w:p>
-      <w:r>
-        <w:t xml:space="preserve">Hapus node module pada folder client </w:t>
-      </w:r>
-      <w:proofErr w:type="spellStart"/>
-      <w:r>
-        <w:t>jalankan</w:t>
-      </w:r>
-      <w:proofErr w:type="spellEnd"/>
-      <w:r>
-        <w:t xml:space="preserve"> </w:t>
-      </w:r>
-      <w:proofErr w:type="spellStart"/>
-      <w:r>
-        <w:t>perintah</w:t>
-      </w:r>
-      <w:proofErr w:type="spellEnd"/>
-      <w:r>
-        <w:t xml:space="preserve"> </w:t>
-      </w:r>
-      <w:proofErr w:type="spellStart"/>
-      <w:r>
-        <w:t>berikut</w:t>
-      </w:r>
-      <w:proofErr w:type="spellEnd"/>
-    </w:p>
-    <w:p>
-      <w:proofErr w:type="spellStart"/>
-      <w:r>
-        <w:t>npm</w:t>
-      </w:r>
-      <w:proofErr w:type="spellEnd"/>
-      <w:r>
-        <w:t xml:space="preserve"> install react@16.8.6 react-dom@16.8.6 @apollo/react-hooks@3.1.3 apollo-client@2.6.4 apollo-cache-inmemory@1.6.3 apollo-link-http@1.5.16 graphql@14.5.8 graphql-tag@2.10.1 react-router-dom@5.1.2 semantic-ui-css@2.4.1 semantic-ui-react@0.88.1 --save-exact --legacy-peer-deps</w:t>
+      <w:r>
+        <w:t>Menampilkan post</w:t>
+      </w:r>
+    </w:p>
+    <w:p>
+      <w:r>
+        <w:t>Mengambil data post dari mongodb</w:t>
+      </w:r>
+    </w:p>
+    <w:p>
+      <w:r>
+        <w:t>Hapus node module pada folder client jalankan perintah berikut</w:t>
+      </w:r>
+    </w:p>
+    <w:p>
+      <w:r>
+        <w:t>npm install react@16.8.6 react-dom@16.8.6 @apollo/react-hooks@3.1.3 apollo-client@2.6.4 apollo-cache-inmemory@1.6.3 apollo-link-http@1.5.16 graphql@14.5.8 graphql-tag@2.10.1 react-router-dom@5.1.2 semantic-ui-css@2.4.1 semantic-ui-react@0.88.1 --save-exact --legacy-peer-deps</w:t>
       </w:r>
     </w:p>
     <w:p>
@@ -2290,13 +1366,8 @@
       </w:r>
     </w:p>
     <w:p>
-      <w:proofErr w:type="spellStart"/>
-      <w:r>
-        <w:t>npm</w:t>
-      </w:r>
-      <w:proofErr w:type="spellEnd"/>
-      <w:r>
-        <w:t xml:space="preserve"> install moment@2.24.0 --legacy-peer-deps</w:t>
+      <w:r>
+        <w:t>npm install moment@2.24.0 --legacy-peer-deps</w:t>
       </w:r>
     </w:p>
     <w:p>
@@ -2307,7 +1378,23 @@
         <w:t>Login and register page</w:t>
       </w:r>
     </w:p>
+    <w:p>
+      <w:r>
+        <w:t>Menggunakan custom hook</w:t>
+      </w:r>
+      <w:r>
+        <w:t xml:space="preserve"> lihat folder client util hooks.js</w:t>
+      </w:r>
+    </w:p>
     <w:p/>
+    <w:p>
+      <w:pPr>
+        <w:pStyle w:val="Heading2"/>
+      </w:pPr>
+      <w:r>
+        <w:t>Authentication context</w:t>
+      </w:r>
+    </w:p>
     <w:sectPr>
       <w:pgSz w:w="11906" w:h="16838"/>
       <w:pgMar w:top="1440" w:right="1440" w:bottom="1440" w:left="1440" w:header="708" w:footer="708" w:gutter="0"/>
@@ -3829,4 +2916,16 @@
     </a:ext>
   </a:extLst>
 </a:theme>
+</file>
+
+<file path=customXml/item1.xml><?xml version="1.0" encoding="utf-8"?>
+<b:Sources xmlns:b="http://schemas.openxmlformats.org/officeDocument/2006/bibliography" xmlns="http://schemas.openxmlformats.org/officeDocument/2006/bibliography" SelectedStyle="\APASixthEditionOfficeOnline.xsl" StyleName="APA" Version="6"/>
+</file>
+
+<file path=customXml/itemProps1.xml><?xml version="1.0" encoding="utf-8"?>
+<ds:datastoreItem xmlns:ds="http://schemas.openxmlformats.org/officeDocument/2006/customXml" ds:itemID="{8B6C5D1E-B001-4D20-966F-1BA323BA1434}">
+  <ds:schemaRefs>
+    <ds:schemaRef ds:uri="http://schemas.openxmlformats.org/officeDocument/2006/bibliography"/>
+  </ds:schemaRefs>
+</ds:datastoreItem>
 </file>
</xml_diff>

<commit_message>
+ fitur penambahan postingan + fitur validasi postingan
</commit_message>
<xml_diff>
--- a/dokumentasi.docx
+++ b/dokumentasi.docx
@@ -1395,6 +1395,112 @@
         <w:t>Authentication context</w:t>
       </w:r>
     </w:p>
+    <w:p>
+      <w:r>
+        <w:rPr>
+          <w:noProof/>
+        </w:rPr>
+        <w:drawing>
+          <wp:inline distT="0" distB="0" distL="0" distR="0" wp14:anchorId="68A20A5A" wp14:editId="6CA54296">
+            <wp:extent cx="5731510" cy="1578610"/>
+            <wp:effectExtent l="0" t="0" r="2540" b="2540"/>
+            <wp:docPr id="1766222716" name="Picture 1"/>
+            <wp:cNvGraphicFramePr>
+              <a:graphicFrameLocks xmlns:a="http://schemas.openxmlformats.org/drawingml/2006/main" noChangeAspect="1"/>
+            </wp:cNvGraphicFramePr>
+            <a:graphic xmlns:a="http://schemas.openxmlformats.org/drawingml/2006/main">
+              <a:graphicData uri="http://schemas.openxmlformats.org/drawingml/2006/picture">
+                <pic:pic xmlns:pic="http://schemas.openxmlformats.org/drawingml/2006/picture">
+                  <pic:nvPicPr>
+                    <pic:cNvPr id="1766222716" name=""/>
+                    <pic:cNvPicPr/>
+                  </pic:nvPicPr>
+                  <pic:blipFill>
+                    <a:blip r:embed="rId19"/>
+                    <a:stretch>
+                      <a:fillRect/>
+                    </a:stretch>
+                  </pic:blipFill>
+                  <pic:spPr>
+                    <a:xfrm>
+                      <a:off x="0" y="0"/>
+                      <a:ext cx="5731510" cy="1578610"/>
+                    </a:xfrm>
+                    <a:prstGeom prst="rect">
+                      <a:avLst/>
+                    </a:prstGeom>
+                  </pic:spPr>
+                </pic:pic>
+              </a:graphicData>
+            </a:graphic>
+          </wp:inline>
+        </w:drawing>
+      </w:r>
+      <w:r>
+        <w:br/>
+      </w:r>
+      <w:r>
+        <w:br/>
+        <w:t>insall that’s</w:t>
+      </w:r>
+    </w:p>
+    <w:p>
+      <w:pPr>
+        <w:pStyle w:val="Heading1"/>
+      </w:pPr>
+      <w:r>
+        <w:t>ADD</w:t>
+      </w:r>
+      <w:r>
+        <w:t xml:space="preserve"> POSTS</w:t>
+      </w:r>
+    </w:p>
+    <w:p>
+      <w:r>
+        <w:drawing>
+          <wp:inline distT="0" distB="0" distL="0" distR="0" wp14:anchorId="75EC87CF" wp14:editId="46CA45B5">
+            <wp:extent cx="5731510" cy="1943735"/>
+            <wp:effectExtent l="0" t="0" r="2540" b="0"/>
+            <wp:docPr id="1712990700" name="Picture 1"/>
+            <wp:cNvGraphicFramePr>
+              <a:graphicFrameLocks xmlns:a="http://schemas.openxmlformats.org/drawingml/2006/main" noChangeAspect="1"/>
+            </wp:cNvGraphicFramePr>
+            <a:graphic xmlns:a="http://schemas.openxmlformats.org/drawingml/2006/main">
+              <a:graphicData uri="http://schemas.openxmlformats.org/drawingml/2006/picture">
+                <pic:pic xmlns:pic="http://schemas.openxmlformats.org/drawingml/2006/picture">
+                  <pic:nvPicPr>
+                    <pic:cNvPr id="1712990700" name=""/>
+                    <pic:cNvPicPr/>
+                  </pic:nvPicPr>
+                  <pic:blipFill>
+                    <a:blip r:embed="rId20"/>
+                    <a:stretch>
+                      <a:fillRect/>
+                    </a:stretch>
+                  </pic:blipFill>
+                  <pic:spPr>
+                    <a:xfrm>
+                      <a:off x="0" y="0"/>
+                      <a:ext cx="5731510" cy="1943735"/>
+                    </a:xfrm>
+                    <a:prstGeom prst="rect">
+                      <a:avLst/>
+                    </a:prstGeom>
+                  </pic:spPr>
+                </pic:pic>
+              </a:graphicData>
+            </a:graphic>
+          </wp:inline>
+        </w:drawing>
+      </w:r>
+    </w:p>
+    <w:p>
+      <w:r>
+        <w:t>Install that</w:t>
+      </w:r>
+    </w:p>
+    <w:p/>
+    <w:p/>
     <w:sectPr>
       <w:pgSz w:w="11906" w:h="16838"/>
       <w:pgMar w:top="1440" w:right="1440" w:bottom="1440" w:left="1440" w:header="708" w:footer="708" w:gutter="0"/>

</xml_diff>

<commit_message>
+ bisa hapus post + hapus post dengan komponen sendiri tanpa reload page + penjelasan fundamental mengenai mekanisme graphql
</commit_message>
<xml_diff>
--- a/dokumentasi.docx
+++ b/dokumentasi.docx
@@ -1457,6 +1457,9 @@
     </w:p>
     <w:p>
       <w:r>
+        <w:rPr>
+          <w:noProof/>
+        </w:rPr>
         <w:drawing>
           <wp:inline distT="0" distB="0" distL="0" distR="0" wp14:anchorId="75EC87CF" wp14:editId="46CA45B5">
             <wp:extent cx="5731510" cy="1943735"/>
@@ -1499,6 +1502,15 @@
         <w:t>Install that</w:t>
       </w:r>
     </w:p>
+    <w:p>
+      <w:pPr>
+        <w:pStyle w:val="Heading1"/>
+      </w:pPr>
+      <w:r>
+        <w:t>Single post page</w:t>
+      </w:r>
+    </w:p>
+    <w:p/>
     <w:p/>
     <w:p/>
     <w:sectPr>

</xml_diff>